<commit_message>
Se agrega al Proyecto
</commit_message>
<xml_diff>
--- a/INFORME SIIGA.docx
+++ b/INFORME SIIGA.docx
@@ -28,31 +28,18 @@
           <w:color w:val="002060"/>
           <w:lang w:val="es-MX"/>
         </w:rPr>
-        <w:t xml:space="preserve">--- </w:t>
-      </w:r>
-      <w:r>
-        <w:rPr>
-          <w:color w:val="002060"/>
-          <w:lang w:val="es-MX"/>
-        </w:rPr>
-        <w:t>Application.java</w:t>
-      </w:r>
-      <w:r>
-        <w:rPr>
-          <w:color w:val="002060"/>
-          <w:lang w:val="es-MX"/>
-        </w:rPr>
-        <w:t xml:space="preserve"> ---</w:t>
-      </w:r>
-    </w:p>
-    <w:p>
-      <w:pPr>
-        <w:rPr>
-          <w:lang w:val="es-MX"/>
-        </w:rPr>
-      </w:pPr>
-      <w:r>
-        <w:rPr>
+        <w:t>--- Application.java ---</w:t>
+      </w:r>
+    </w:p>
+    <w:p>
+      <w:pPr>
+        <w:rPr>
+          <w:lang w:val="es-MX"/>
+        </w:rPr>
+      </w:pPr>
+      <w:r>
+        <w:rPr>
+          <w:noProof/>
           <w:lang w:val="es-MX"/>
         </w:rPr>
         <w:drawing>
@@ -161,16 +148,7 @@
           <w:sz w:val="24"/>
           <w:szCs w:val="24"/>
         </w:rPr>
-        <w:t>@Controller, @Service, @</w:t>
-      </w:r>
-      <w:r>
-        <w:rPr>
-          <w:rFonts w:ascii="Times New Roman" w:hAnsi="Times New Roman" w:cs="Times New Roman"/>
-          <w:color w:val="8DA1B9"/>
-          <w:sz w:val="24"/>
-          <w:szCs w:val="24"/>
-        </w:rPr>
-        <w:t>Repository, etc.)</w:t>
+        <w:t>@Controller, @Service, @Repository, etc.)</w:t>
       </w:r>
       <w:r>
         <w:rPr>
@@ -280,6 +258,7 @@
       <w:r>
         <w:rPr>
           <w:rFonts w:ascii="Times New Roman" w:hAnsi="Times New Roman" w:cs="Times New Roman"/>
+          <w:noProof/>
           <w:color w:val="F9FAFB"/>
           <w:sz w:val="24"/>
           <w:szCs w:val="24"/>
@@ -419,17 +398,7 @@
           <w:sz w:val="24"/>
           <w:szCs w:val="24"/>
         </w:rPr>
-        <w:t>@Override</w:t>
-      </w:r>
-      <w:r>
-        <w:rPr>
-          <w:rStyle w:val="token"/>
-          <w:rFonts w:ascii="Times New Roman" w:hAnsi="Times New Roman" w:cs="Times New Roman"/>
-          <w:color w:val="0F4761" w:themeColor="accent1" w:themeShade="BF"/>
-          <w:sz w:val="24"/>
-          <w:szCs w:val="24"/>
-        </w:rPr>
-        <w:t xml:space="preserve"> </w:t>
+        <w:t xml:space="preserve">@Override </w:t>
       </w:r>
       <w:r>
         <w:rPr>
@@ -572,11 +541,12 @@
       </w:pPr>
       <w:r>
         <w:rPr>
+          <w:noProof/>
           <w:color w:val="002060"/>
           <w:lang w:val="es-MX"/>
         </w:rPr>
         <w:drawing>
-          <wp:anchor distT="0" distB="0" distL="114300" distR="114300" simplePos="0" relativeHeight="251660288" behindDoc="0" locked="0" layoutInCell="1" allowOverlap="1" wp14:anchorId="611E5617" wp14:editId="173903CC">
+          <wp:anchor distT="0" distB="0" distL="114300" distR="114300" simplePos="0" relativeHeight="251660288" behindDoc="0" locked="0" layoutInCell="1" allowOverlap="1" wp14:anchorId="611E5617" wp14:editId="46DC306E">
             <wp:simplePos x="0" y="0"/>
             <wp:positionH relativeFrom="margin">
               <wp:align>right</wp:align>
@@ -730,6 +700,7 @@
       </w:pPr>
       <w:r>
         <w:rPr>
+          <w:noProof/>
           <w:lang w:val="es-MX"/>
         </w:rPr>
         <w:drawing>
@@ -1112,8 +1083,9 @@
           <w:lang w:eastAsia="es-PE"/>
           <w14:ligatures w14:val="none"/>
         </w:rPr>
-        <w:t>//</w:t>
-      </w:r>
+        <w:t xml:space="preserve">//Llama al </w:t>
+      </w:r>
+      <w:proofErr w:type="spellStart"/>
       <w:r>
         <w:rPr>
           <w:rFonts w:ascii="Consolas" w:eastAsia="Times New Roman" w:hAnsi="Consolas" w:cs="Times New Roman"/>
@@ -1124,9 +1096,9 @@
           <w:lang w:eastAsia="es-PE"/>
           <w14:ligatures w14:val="none"/>
         </w:rPr>
-        <w:t xml:space="preserve">Llama al </w:t>
-      </w:r>
-      <w:proofErr w:type="spellStart"/>
+        <w:t>return</w:t>
+      </w:r>
+      <w:proofErr w:type="spellEnd"/>
       <w:r>
         <w:rPr>
           <w:rFonts w:ascii="Consolas" w:eastAsia="Times New Roman" w:hAnsi="Consolas" w:cs="Times New Roman"/>
@@ -1137,9 +1109,8 @@
           <w:lang w:eastAsia="es-PE"/>
           <w14:ligatures w14:val="none"/>
         </w:rPr>
-        <w:t>return</w:t>
-      </w:r>
-      <w:proofErr w:type="spellEnd"/>
+        <w:t xml:space="preserve">, para que este lo use luego </w:t>
+      </w:r>
       <w:r>
         <w:rPr>
           <w:rFonts w:ascii="Consolas" w:eastAsia="Times New Roman" w:hAnsi="Consolas" w:cs="Times New Roman"/>
@@ -1150,7 +1121,7 @@
           <w:lang w:eastAsia="es-PE"/>
           <w14:ligatures w14:val="none"/>
         </w:rPr>
-        <w:t xml:space="preserve">, para que este lo use luego </w:t>
+        <w:t>en</w:t>
       </w:r>
       <w:r>
         <w:rPr>
@@ -1162,9 +1133,13 @@
           <w:lang w:eastAsia="es-PE"/>
           <w14:ligatures w14:val="none"/>
         </w:rPr>
-        <w:t>en</w:t>
-      </w:r>
-      <w:r>
+        <w:t xml:space="preserve">    </w:t>
+      </w:r>
+    </w:p>
+    <w:p>
+      <w:pPr>
+        <w:shd w:val="clear" w:color="auto" w:fill="1F1F1F"/>
+        <w:spacing w:line="285" w:lineRule="atLeast"/>
         <w:rPr>
           <w:rFonts w:ascii="Consolas" w:eastAsia="Times New Roman" w:hAnsi="Consolas" w:cs="Times New Roman"/>
           <w:color w:val="92D050"/>
@@ -1174,13 +1149,8 @@
           <w:lang w:eastAsia="es-PE"/>
           <w14:ligatures w14:val="none"/>
         </w:rPr>
-        <w:t xml:space="preserve">    </w:t>
-      </w:r>
-    </w:p>
-    <w:p>
-      <w:pPr>
-        <w:shd w:val="clear" w:color="auto" w:fill="1F1F1F"/>
-        <w:spacing w:line="285" w:lineRule="atLeast"/>
+      </w:pPr>
+      <w:r>
         <w:rPr>
           <w:rFonts w:ascii="Consolas" w:eastAsia="Times New Roman" w:hAnsi="Consolas" w:cs="Times New Roman"/>
           <w:color w:val="92D050"/>
@@ -1190,7 +1160,8 @@
           <w:lang w:eastAsia="es-PE"/>
           <w14:ligatures w14:val="none"/>
         </w:rPr>
-      </w:pPr>
+        <w:t xml:space="preserve"> </w:t>
+      </w:r>
       <w:r>
         <w:rPr>
           <w:rFonts w:ascii="Consolas" w:eastAsia="Times New Roman" w:hAnsi="Consolas" w:cs="Times New Roman"/>
@@ -1201,8 +1172,9 @@
           <w:lang w:eastAsia="es-PE"/>
           <w14:ligatures w14:val="none"/>
         </w:rPr>
-        <w:t xml:space="preserve"> </w:t>
-      </w:r>
+        <w:t>// “</w:t>
+      </w:r>
+      <w:proofErr w:type="spellStart"/>
       <w:r>
         <w:rPr>
           <w:rFonts w:ascii="Consolas" w:eastAsia="Times New Roman" w:hAnsi="Consolas" w:cs="Times New Roman"/>
@@ -1213,9 +1185,9 @@
           <w:lang w:eastAsia="es-PE"/>
           <w14:ligatures w14:val="none"/>
         </w:rPr>
-        <w:t>// “</w:t>
-      </w:r>
-      <w:proofErr w:type="spellStart"/>
+        <w:t>nuevoCurso.setHorario</w:t>
+      </w:r>
+      <w:proofErr w:type="spellEnd"/>
       <w:r>
         <w:rPr>
           <w:rFonts w:ascii="Consolas" w:eastAsia="Times New Roman" w:hAnsi="Consolas" w:cs="Times New Roman"/>
@@ -1226,9 +1198,8 @@
           <w:lang w:eastAsia="es-PE"/>
           <w14:ligatures w14:val="none"/>
         </w:rPr>
-        <w:t>nuevoCurso.setHorario</w:t>
-      </w:r>
-      <w:proofErr w:type="spellEnd"/>
+        <w:t>(horario)”</w:t>
+      </w:r>
       <w:r>
         <w:rPr>
           <w:rFonts w:ascii="Consolas" w:eastAsia="Times New Roman" w:hAnsi="Consolas" w:cs="Times New Roman"/>
@@ -1239,30 +1210,6 @@
           <w:lang w:eastAsia="es-PE"/>
           <w14:ligatures w14:val="none"/>
         </w:rPr>
-        <w:t>(horario)</w:t>
-      </w:r>
-      <w:r>
-        <w:rPr>
-          <w:rFonts w:ascii="Consolas" w:eastAsia="Times New Roman" w:hAnsi="Consolas" w:cs="Times New Roman"/>
-          <w:color w:val="92D050"/>
-          <w:kern w:val="0"/>
-          <w:sz w:val="21"/>
-          <w:szCs w:val="21"/>
-          <w:lang w:eastAsia="es-PE"/>
-          <w14:ligatures w14:val="none"/>
-        </w:rPr>
-        <w:t>”</w:t>
-      </w:r>
-      <w:r>
-        <w:rPr>
-          <w:rFonts w:ascii="Consolas" w:eastAsia="Times New Roman" w:hAnsi="Consolas" w:cs="Times New Roman"/>
-          <w:color w:val="92D050"/>
-          <w:kern w:val="0"/>
-          <w:sz w:val="21"/>
-          <w:szCs w:val="21"/>
-          <w:lang w:eastAsia="es-PE"/>
-          <w14:ligatures w14:val="none"/>
-        </w:rPr>
         <w:t>:</w:t>
       </w:r>
     </w:p>
@@ -1618,21 +1565,7 @@
           <w:color w:val="002060"/>
           <w:lang w:val="es-MX"/>
         </w:rPr>
-        <w:t xml:space="preserve">--- </w:t>
-      </w:r>
-      <w:r>
-        <w:rPr>
-          <w:color w:val="002060"/>
-          <w:lang w:val="es-MX"/>
-        </w:rPr>
-        <w:t>CursoRepository.java</w:t>
-      </w:r>
-      <w:r>
-        <w:rPr>
-          <w:color w:val="002060"/>
-          <w:lang w:val="es-MX"/>
-        </w:rPr>
-        <w:t xml:space="preserve"> ---</w:t>
+        <w:t>--- CursoRepository.java ---</w:t>
       </w:r>
     </w:p>
     <w:p>
@@ -1693,6 +1626,7 @@
       </w:pPr>
       <w:r>
         <w:rPr>
+          <w:noProof/>
           <w:lang w:val="es-MX"/>
         </w:rPr>
         <w:drawing>
@@ -1820,21 +1754,7 @@
           <w:color w:val="002060"/>
           <w:lang w:val="es-MX"/>
         </w:rPr>
-        <w:t xml:space="preserve">--- </w:t>
-      </w:r>
-      <w:r>
-        <w:rPr>
-          <w:color w:val="002060"/>
-          <w:lang w:val="es-MX"/>
-        </w:rPr>
-        <w:t>Matricula.java</w:t>
-      </w:r>
-      <w:r>
-        <w:rPr>
-          <w:color w:val="002060"/>
-          <w:lang w:val="es-MX"/>
-        </w:rPr>
-        <w:t xml:space="preserve"> ---</w:t>
+        <w:t>--- Matricula.java ---</w:t>
       </w:r>
     </w:p>
     <w:p>
@@ -1847,6 +1767,7 @@
       </w:pPr>
       <w:r>
         <w:rPr>
+          <w:noProof/>
           <w:lang w:val="es-MX"/>
         </w:rPr>
         <w:drawing>
@@ -1907,6 +1828,7 @@
       </w:r>
       <w:r>
         <w:rPr>
+          <w:noProof/>
           <w:lang w:val="es-MX"/>
         </w:rPr>
         <mc:AlternateContent>
@@ -2004,6 +1926,7 @@
       </w:r>
       <w:r>
         <w:rPr>
+          <w:noProof/>
           <w:lang w:val="es-MX"/>
         </w:rPr>
         <mc:AlternateContent>
@@ -2097,6 +2020,7 @@
       </w:r>
       <w:r>
         <w:rPr>
+          <w:noProof/>
           <w:lang w:val="es-MX"/>
         </w:rPr>
         <mc:AlternateContent>
@@ -2190,6 +2114,7 @@
       </w:r>
       <w:r>
         <w:rPr>
+          <w:noProof/>
           <w:lang w:val="es-MX"/>
         </w:rPr>
         <mc:AlternateContent>
@@ -2283,6 +2208,7 @@
       </w:r>
       <w:r>
         <w:rPr>
+          <w:noProof/>
           <w:lang w:val="es-MX"/>
         </w:rPr>
         <w:drawing>
@@ -2766,6 +2692,7 @@
       </w:pPr>
       <w:r>
         <w:rPr>
+          <w:noProof/>
           <w:color w:val="002060"/>
           <w:lang w:val="es-MX"/>
         </w:rPr>
@@ -2860,21 +2787,7 @@
           <w:color w:val="002060"/>
           <w:lang w:val="es-MX"/>
         </w:rPr>
-        <w:t xml:space="preserve">--- </w:t>
-      </w:r>
-      <w:r>
-        <w:rPr>
-          <w:color w:val="002060"/>
-          <w:lang w:val="es-MX"/>
-        </w:rPr>
-        <w:t>MatriculaRepository.java</w:t>
-      </w:r>
-      <w:r>
-        <w:rPr>
-          <w:color w:val="002060"/>
-          <w:lang w:val="es-MX"/>
-        </w:rPr>
-        <w:t xml:space="preserve"> ---</w:t>
+        <w:t>--- MatriculaRepository.java ---</w:t>
       </w:r>
     </w:p>
     <w:p>
@@ -2887,6 +2800,7 @@
       </w:pPr>
       <w:r>
         <w:rPr>
+          <w:noProof/>
           <w:lang w:val="es-MX"/>
         </w:rPr>
         <w:drawing>
@@ -3038,21 +2952,7 @@
           <w:color w:val="002060"/>
           <w:lang w:val="es-MX"/>
         </w:rPr>
-        <w:t xml:space="preserve">--- </w:t>
-      </w:r>
-      <w:r>
-        <w:rPr>
-          <w:color w:val="002060"/>
-          <w:lang w:val="es-MX"/>
-        </w:rPr>
-        <w:t>Usuario.java</w:t>
-      </w:r>
-      <w:r>
-        <w:rPr>
-          <w:color w:val="002060"/>
-          <w:lang w:val="es-MX"/>
-        </w:rPr>
-        <w:t xml:space="preserve"> ---</w:t>
+        <w:t>--- Usuario.java ---</w:t>
       </w:r>
     </w:p>
     <w:p>
@@ -3092,6 +2992,7 @@
       </w:pPr>
       <w:r>
         <w:rPr>
+          <w:noProof/>
           <w:color w:val="002060"/>
           <w:lang w:val="es-MX"/>
         </w:rPr>
@@ -3199,6 +3100,7 @@
       </w:pPr>
       <w:r>
         <w:rPr>
+          <w:noProof/>
           <w:lang w:val="es-MX"/>
         </w:rPr>
         <w:drawing>
@@ -3335,21 +3237,7 @@
           <w:color w:val="002060"/>
           <w:lang w:val="es-MX"/>
         </w:rPr>
-        <w:t xml:space="preserve">--- </w:t>
-      </w:r>
-      <w:r>
-        <w:rPr>
-          <w:color w:val="002060"/>
-          <w:lang w:val="es-MX"/>
-        </w:rPr>
-        <w:t>UsuarioRepository.java</w:t>
-      </w:r>
-      <w:r>
-        <w:rPr>
-          <w:color w:val="002060"/>
-          <w:lang w:val="es-MX"/>
-        </w:rPr>
-        <w:t xml:space="preserve"> ---</w:t>
+        <w:t>--- UsuarioRepository.java ---</w:t>
       </w:r>
     </w:p>
     <w:p>
@@ -3413,6 +3301,7 @@
       </w:pPr>
       <w:r>
         <w:rPr>
+          <w:noProof/>
           <w:color w:val="002060"/>
           <w:lang w:val="es-MX"/>
         </w:rPr>
@@ -3507,6 +3396,7 @@
       </w:pPr>
       <w:r>
         <w:rPr>
+          <w:noProof/>
           <w:color w:val="002060"/>
           <w:lang w:val="es-MX"/>
         </w:rPr>
@@ -3560,21 +3450,7 @@
           <w:color w:val="002060"/>
           <w:lang w:val="es-MX"/>
         </w:rPr>
-        <w:t xml:space="preserve">--- </w:t>
-      </w:r>
-      <w:r>
-        <w:rPr>
-          <w:color w:val="002060"/>
-          <w:lang w:val="es-MX"/>
-        </w:rPr>
-        <w:t>PortalController.java</w:t>
-      </w:r>
-      <w:r>
-        <w:rPr>
-          <w:color w:val="002060"/>
-          <w:lang w:val="es-MX"/>
-        </w:rPr>
-        <w:t xml:space="preserve"> ---</w:t>
+        <w:t>--- PortalController.java ---</w:t>
       </w:r>
     </w:p>
     <w:p>
@@ -3587,6 +3463,7 @@
       </w:pPr>
       <w:r>
         <w:rPr>
+          <w:noProof/>
           <w:color w:val="002060"/>
           <w:lang w:val="es-MX"/>
         </w:rPr>
@@ -3639,6 +3516,7 @@
           <w:lang w:val="es-MX"/>
         </w:rPr>
       </w:pPr>
+      <w:bookmarkStart w:id="0" w:name="_Hlk217412462"/>
       <w:r>
         <w:rPr>
           <w:color w:val="002060"/>
@@ -3750,6 +3628,7 @@
       </w:pPr>
       <w:r>
         <w:rPr>
+          <w:noProof/>
           <w:lang w:val="es-MX"/>
         </w:rPr>
         <w:drawing>
@@ -3804,6 +3683,7 @@
       </w:r>
       <w:r>
         <w:rPr>
+          <w:noProof/>
           <w:lang w:val="es-MX"/>
         </w:rPr>
         <w:drawing>
@@ -3864,6 +3744,7 @@
       </w:r>
       <w:r>
         <w:rPr>
+          <w:noProof/>
           <w:lang w:val="es-MX"/>
         </w:rPr>
         <w:drawing>
@@ -3944,6 +3825,7 @@
         </w:rPr>
         <w:t>Para pasar de datos java a HTML.</w:t>
       </w:r>
+      <w:bookmarkEnd w:id="0"/>
     </w:p>
     <w:p>
       <w:pPr>
@@ -3953,6 +3835,7 @@
           <w:lang w:val="es-MX"/>
         </w:rPr>
       </w:pPr>
+      <w:bookmarkStart w:id="1" w:name="_Hlk217412731"/>
       <w:r>
         <w:rPr>
           <w:color w:val="002060"/>
@@ -4100,6 +3983,7 @@
       </w:pPr>
       <w:r>
         <w:rPr>
+          <w:noProof/>
           <w:color w:val="002060"/>
           <w:lang w:val="es-MX"/>
         </w:rPr>
@@ -4155,6 +4039,7 @@
       </w:r>
       <w:r>
         <w:rPr>
+          <w:noProof/>
           <w:color w:val="002060"/>
           <w:lang w:val="es-MX"/>
         </w:rPr>
@@ -4475,6 +4360,7 @@
         <w:t>, te redirecciona (cambiando el URL completamente)</w:t>
       </w:r>
     </w:p>
+    <w:bookmarkEnd w:id="1"/>
     <w:p>
       <w:pPr>
         <w:rPr>
@@ -4510,6 +4396,7 @@
       </w:pPr>
       <w:r>
         <w:rPr>
+          <w:noProof/>
           <w:lang w:val="es-MX"/>
         </w:rPr>
         <w:lastRenderedPageBreak/>
@@ -4797,6 +4684,7 @@
       </w:pPr>
       <w:r>
         <w:rPr>
+          <w:noProof/>
           <w:color w:val="000000" w:themeColor="text1"/>
           <w:lang w:val="es-MX"/>
         </w:rPr>
@@ -4865,6 +4753,7 @@
           <w:lang w:val="es-MX"/>
         </w:rPr>
       </w:pPr>
+      <w:bookmarkStart w:id="2" w:name="_Hlk217412970"/>
       <w:r>
         <w:rPr>
           <w:lang w:val="es-MX"/>
@@ -4947,6 +4836,7 @@
       </w:pPr>
       <w:r>
         <w:rPr>
+          <w:noProof/>
           <w:color w:val="002060"/>
           <w:lang w:val="es-MX"/>
         </w:rPr>
@@ -5034,14 +4924,16 @@
         <w:t xml:space="preserve"> </w:t>
       </w:r>
     </w:p>
-    <w:p>
-      <w:pPr>
-        <w:rPr>
-          <w:lang w:val="es-MX"/>
-        </w:rPr>
-      </w:pPr>
-      <w:r>
-        <w:rPr>
+    <w:bookmarkEnd w:id="2"/>
+    <w:p>
+      <w:pPr>
+        <w:rPr>
+          <w:lang w:val="es-MX"/>
+        </w:rPr>
+      </w:pPr>
+      <w:r>
+        <w:rPr>
+          <w:noProof/>
           <w:lang w:val="es-MX"/>
         </w:rPr>
         <w:lastRenderedPageBreak/>
@@ -5129,6 +5021,7 @@
       </w:pPr>
       <w:r>
         <w:rPr>
+          <w:noProof/>
           <w:color w:val="002060"/>
           <w:lang w:val="es-MX"/>
         </w:rPr>
@@ -5200,6 +5093,7 @@
           <w:lang w:val="es-MX"/>
         </w:rPr>
       </w:pPr>
+      <w:bookmarkStart w:id="3" w:name="_Hlk217413092"/>
       <w:r>
         <w:rPr>
           <w:color w:val="000000" w:themeColor="text1"/>
@@ -5334,6 +5228,7 @@
       </w:pPr>
       <w:r>
         <w:rPr>
+          <w:noProof/>
           <w:color w:val="000000" w:themeColor="text1"/>
           <w:lang w:val="es-MX"/>
         </w:rPr>
@@ -5402,6 +5297,7 @@
         <w:t>“admin-editar-notas.html”.</w:t>
       </w:r>
     </w:p>
+    <w:bookmarkEnd w:id="3"/>
     <w:p>
       <w:pPr>
         <w:ind w:left="360"/>
@@ -5414,11 +5310,12 @@
       </w:pPr>
       <w:r>
         <w:rPr>
+          <w:noProof/>
           <w:color w:val="002060"/>
           <w:lang w:val="es-MX"/>
         </w:rPr>
         <w:drawing>
-          <wp:anchor distT="0" distB="0" distL="114300" distR="114300" simplePos="0" relativeHeight="251689984" behindDoc="0" locked="0" layoutInCell="1" allowOverlap="1" wp14:anchorId="7E71F6F0" wp14:editId="323A4483">
+          <wp:anchor distT="0" distB="0" distL="114300" distR="114300" simplePos="0" relativeHeight="251689984" behindDoc="0" locked="0" layoutInCell="1" allowOverlap="1" wp14:anchorId="7E71F6F0" wp14:editId="7388D121">
             <wp:simplePos x="0" y="0"/>
             <wp:positionH relativeFrom="margin">
               <wp:align>right</wp:align>
@@ -5481,6 +5378,7 @@
         <w:rPr>
           <w:b/>
           <w:bCs/>
+          <w:noProof/>
           <w:color w:val="000000" w:themeColor="text1"/>
           <w:lang w:val="es-MX"/>
         </w:rPr>
@@ -5636,7 +5534,6 @@
           <w:lang w:val="es-MX"/>
         </w:rPr>
       </w:pPr>
-      <w:proofErr w:type="spellStart"/>
       <w:r>
         <w:rPr>
           <w:b/>
@@ -5644,9 +5541,8 @@
           <w:color w:val="000000" w:themeColor="text1"/>
           <w:lang w:val="es-MX"/>
         </w:rPr>
-        <w:t>Retonar</w:t>
-      </w:r>
-      <w:proofErr w:type="spellEnd"/>
+        <w:t>Reto</w:t>
+      </w:r>
       <w:r>
         <w:rPr>
           <w:b/>
@@ -5654,7 +5550,16 @@
           <w:color w:val="000000" w:themeColor="text1"/>
           <w:lang w:val="es-MX"/>
         </w:rPr>
-        <w:t xml:space="preserve"> a </w:t>
+        <w:t>r</w:t>
+      </w:r>
+      <w:r>
+        <w:rPr>
+          <w:b/>
+          <w:bCs/>
+          <w:color w:val="000000" w:themeColor="text1"/>
+          <w:lang w:val="es-MX"/>
+        </w:rPr>
+        <w:t xml:space="preserve">na a </w:t>
       </w:r>
       <w:r>
         <w:rPr>
@@ -5891,6 +5796,7 @@
       </w:pPr>
       <w:r>
         <w:rPr>
+          <w:noProof/>
           <w:color w:val="000000" w:themeColor="text1"/>
           <w:lang w:val="es-MX"/>
         </w:rPr>
@@ -6000,6 +5906,7 @@
       </w:pPr>
       <w:r>
         <w:rPr>
+          <w:noProof/>
           <w:color w:val="002060"/>
           <w:lang w:val="es-MX"/>
         </w:rPr>
@@ -6230,6 +6137,7 @@
       </w:pPr>
       <w:r>
         <w:rPr>
+          <w:noProof/>
           <w:color w:val="002060"/>
           <w:lang w:val="es-MX"/>
         </w:rPr>
@@ -6354,6 +6262,7 @@
       </w:pPr>
       <w:r>
         <w:rPr>
+          <w:noProof/>
           <w:color w:val="002060"/>
           <w:lang w:val="es-MX"/>
         </w:rPr>
@@ -6626,6 +6535,7 @@
       </w:r>
       <w:r>
         <w:rPr>
+          <w:noProof/>
           <w:lang w:val="es-MX"/>
         </w:rPr>
         <w:drawing>
@@ -6686,6 +6596,7 @@
       </w:r>
       <w:r>
         <w:rPr>
+          <w:noProof/>
           <w:color w:val="002060"/>
           <w:lang w:val="es-MX"/>
         </w:rPr>
@@ -6802,6 +6713,7 @@
       </w:pPr>
       <w:r>
         <w:rPr>
+          <w:noProof/>
           <w:lang w:val="es-MX"/>
         </w:rPr>
         <w:drawing>
@@ -6925,24 +6837,53 @@
         <w:rPr>
           <w:lang w:val="es-MX"/>
         </w:rPr>
-        <w:t>Cada vez que se escribe algo en el input, se verifica si esta cumpliendo las reglas que introduje en los DOM, si esta mal rellenado (este formulario no se enviara, lo que genera que no te lleve a ninguna ruta o URL).</w:t>
-      </w:r>
-    </w:p>
-    <w:p>
-      <w:pPr>
-        <w:rPr>
-          <w:lang w:val="es-MX"/>
-        </w:rPr>
-      </w:pPr>
-    </w:p>
-    <w:p>
-      <w:pPr>
-        <w:rPr>
-          <w:lang w:val="es-MX"/>
-        </w:rPr>
-      </w:pPr>
-      <w:r>
-        <w:rPr>
+        <w:t xml:space="preserve">Cada vez que se escribe algo en el input, se verifica si </w:t>
+      </w:r>
+      <w:proofErr w:type="spellStart"/>
+      <w:r>
+        <w:rPr>
+          <w:lang w:val="es-MX"/>
+        </w:rPr>
+        <w:t>esta</w:t>
+      </w:r>
+      <w:proofErr w:type="spellEnd"/>
+      <w:r>
+        <w:rPr>
+          <w:lang w:val="es-MX"/>
+        </w:rPr>
+        <w:t xml:space="preserve"> cumpliendo las reglas que introduje en los DOM, si </w:t>
+      </w:r>
+      <w:proofErr w:type="spellStart"/>
+      <w:r>
+        <w:rPr>
+          <w:lang w:val="es-MX"/>
+        </w:rPr>
+        <w:t>esta</w:t>
+      </w:r>
+      <w:proofErr w:type="spellEnd"/>
+      <w:r>
+        <w:rPr>
+          <w:lang w:val="es-MX"/>
+        </w:rPr>
+        <w:t xml:space="preserve"> mal rellenado (este formulario no se enviara, lo que genera que no te lleve a ninguna ruta o URL).</w:t>
+      </w:r>
+    </w:p>
+    <w:p>
+      <w:pPr>
+        <w:rPr>
+          <w:lang w:val="es-MX"/>
+        </w:rPr>
+      </w:pPr>
+    </w:p>
+    <w:p>
+      <w:pPr>
+        <w:rPr>
+          <w:lang w:val="es-MX"/>
+        </w:rPr>
+      </w:pPr>
+      <w:r>
+        <w:rPr>
+          <w:noProof/>
           <w:lang w:val="es-MX"/>
         </w:rPr>
         <w:drawing>
@@ -7003,6 +6944,7 @@
       </w:r>
       <w:r>
         <w:rPr>
+          <w:noProof/>
           <w:lang w:val="es-MX"/>
         </w:rPr>
         <w:drawing>
@@ -7063,6 +7005,7 @@
       </w:r>
       <w:r>
         <w:rPr>
+          <w:noProof/>
           <w:color w:val="002060"/>
           <w:lang w:val="es-MX"/>
         </w:rPr>
@@ -7124,6 +7067,7 @@
       </w:r>
       <w:r>
         <w:rPr>
+          <w:noProof/>
           <w:lang w:val="es-MX"/>
         </w:rPr>
         <w:drawing>
@@ -7210,6 +7154,7 @@
       </w:pPr>
       <w:r>
         <w:rPr>
+          <w:noProof/>
           <w:lang w:val="es-MX"/>
         </w:rPr>
         <w:lastRenderedPageBreak/>
@@ -7306,6 +7251,7 @@
       </w:pPr>
       <w:r>
         <w:rPr>
+          <w:noProof/>
           <w:lang w:val="es-MX"/>
         </w:rPr>
         <w:drawing>
@@ -7366,6 +7312,7 @@
       </w:r>
       <w:r>
         <w:rPr>
+          <w:noProof/>
           <w:lang w:val="es-MX"/>
         </w:rPr>
         <w:drawing>
@@ -7452,6 +7399,224 @@
           <w:lang w:val="es-MX"/>
         </w:rPr>
         <w:t>(depende a como este llenado los inputs, este reaccionara).</w:t>
+      </w:r>
+    </w:p>
+    <w:p>
+      <w:pPr>
+        <w:pStyle w:val="Prrafodelista"/>
+        <w:rPr>
+          <w:noProof/>
+        </w:rPr>
+      </w:pPr>
+      <w:r>
+        <w:rPr>
+          <w:lang w:val="es-MX"/>
+        </w:rPr>
+        <w:lastRenderedPageBreak/>
+        <w:drawing>
+          <wp:anchor distT="0" distB="0" distL="114300" distR="114300" simplePos="0" relativeHeight="251704320" behindDoc="0" locked="0" layoutInCell="1" allowOverlap="1" wp14:anchorId="0669262A" wp14:editId="6891664C">
+            <wp:simplePos x="0" y="0"/>
+            <wp:positionH relativeFrom="margin">
+              <wp:align>right</wp:align>
+            </wp:positionH>
+            <wp:positionV relativeFrom="page">
+              <wp:posOffset>1181100</wp:posOffset>
+            </wp:positionV>
+            <wp:extent cx="4822190" cy="2819400"/>
+            <wp:effectExtent l="0" t="0" r="0" b="0"/>
+            <wp:wrapTopAndBottom/>
+            <wp:docPr id="7" name="Imagen 7"/>
+            <wp:cNvGraphicFramePr>
+              <a:graphicFrameLocks xmlns:a="http://schemas.openxmlformats.org/drawingml/2006/main" noChangeAspect="1"/>
+            </wp:cNvGraphicFramePr>
+            <a:graphic xmlns:a="http://schemas.openxmlformats.org/drawingml/2006/main">
+              <a:graphicData uri="http://schemas.openxmlformats.org/drawingml/2006/picture">
+                <pic:pic xmlns:pic="http://schemas.openxmlformats.org/drawingml/2006/picture">
+                  <pic:nvPicPr>
+                    <pic:cNvPr id="1" name=""/>
+                    <pic:cNvPicPr/>
+                  </pic:nvPicPr>
+                  <pic:blipFill rotWithShape="1">
+                    <a:blip r:embed="rId44">
+                      <a:extLst>
+                        <a:ext uri="{28A0092B-C50C-407E-A947-70E740481C1C}">
+                          <a14:useLocalDpi xmlns:a14="http://schemas.microsoft.com/office/drawing/2010/main" val="0"/>
+                        </a:ext>
+                      </a:extLst>
+                    </a:blip>
+                    <a:srcRect l="31795"/>
+                    <a:stretch/>
+                  </pic:blipFill>
+                  <pic:spPr bwMode="auto">
+                    <a:xfrm>
+                      <a:off x="0" y="0"/>
+                      <a:ext cx="4822190" cy="2819400"/>
+                    </a:xfrm>
+                    <a:prstGeom prst="rect">
+                      <a:avLst/>
+                    </a:prstGeom>
+                    <a:ln>
+                      <a:noFill/>
+                    </a:ln>
+                    <a:extLst>
+                      <a:ext uri="{53640926-AAD7-44D8-BBD7-CCE9431645EC}">
+                        <a14:shadowObscured xmlns:a14="http://schemas.microsoft.com/office/drawing/2010/main"/>
+                      </a:ext>
+                    </a:extLst>
+                  </pic:spPr>
+                </pic:pic>
+              </a:graphicData>
+            </a:graphic>
+            <wp14:sizeRelH relativeFrom="margin">
+              <wp14:pctWidth>0</wp14:pctWidth>
+            </wp14:sizeRelH>
+            <wp14:sizeRelV relativeFrom="margin">
+              <wp14:pctHeight>0</wp14:pctHeight>
+            </wp14:sizeRelV>
+          </wp:anchor>
+        </w:drawing>
+      </w:r>
+      <w:r>
+        <w:rPr>
+          <w:lang w:val="es-MX"/>
+        </w:rPr>
+        <w:t>En la BD tiene que estar las siguientes variables(manualmente</w:t>
+      </w:r>
+      <w:proofErr w:type="gramStart"/>
+      <w:r>
+        <w:rPr>
+          <w:lang w:val="es-MX"/>
+        </w:rPr>
+        <w:t>)</w:t>
+      </w:r>
+      <w:r>
+        <w:rPr>
+          <w:noProof/>
+        </w:rPr>
+        <w:t xml:space="preserve"> </w:t>
+      </w:r>
+      <w:r>
+        <w:rPr>
+          <w:noProof/>
+        </w:rPr>
+        <w:t>:</w:t>
+      </w:r>
+      <w:proofErr w:type="gramEnd"/>
+    </w:p>
+    <w:p>
+      <w:pPr>
+        <w:pStyle w:val="Prrafodelista"/>
+        <w:rPr>
+          <w:noProof/>
+        </w:rPr>
+      </w:pPr>
+    </w:p>
+    <w:p>
+      <w:pPr>
+        <w:pStyle w:val="Prrafodelista"/>
+        <w:rPr>
+          <w:noProof/>
+        </w:rPr>
+      </w:pPr>
+      <w:r>
+        <w:rPr>
+          <w:noProof/>
+        </w:rPr>
+        <w:t>Además deben tener puertos diferentes(Se ve referenciado en las variables introducidas):</w:t>
+      </w:r>
+      <w:r>
+        <w:rPr>
+          <w:noProof/>
+        </w:rPr>
+        <w:br/>
+      </w:r>
+      <w:r>
+        <w:rPr>
+          <w:lang w:val="es-MX"/>
+        </w:rPr>
+        <w:drawing>
+          <wp:inline distT="0" distB="0" distL="0" distR="0" wp14:anchorId="493566E3" wp14:editId="2212B5BC">
+            <wp:extent cx="5400040" cy="2425700"/>
+            <wp:effectExtent l="0" t="0" r="0" b="0"/>
+            <wp:docPr id="8" name="Imagen 8"/>
+            <wp:cNvGraphicFramePr>
+              <a:graphicFrameLocks xmlns:a="http://schemas.openxmlformats.org/drawingml/2006/main" noChangeAspect="1"/>
+            </wp:cNvGraphicFramePr>
+            <a:graphic xmlns:a="http://schemas.openxmlformats.org/drawingml/2006/main">
+              <a:graphicData uri="http://schemas.openxmlformats.org/drawingml/2006/picture">
+                <pic:pic xmlns:pic="http://schemas.openxmlformats.org/drawingml/2006/picture">
+                  <pic:nvPicPr>
+                    <pic:cNvPr id="1" name=""/>
+                    <pic:cNvPicPr/>
+                  </pic:nvPicPr>
+                  <pic:blipFill>
+                    <a:blip r:embed="rId45"/>
+                    <a:stretch>
+                      <a:fillRect/>
+                    </a:stretch>
+                  </pic:blipFill>
+                  <pic:spPr>
+                    <a:xfrm>
+                      <a:off x="0" y="0"/>
+                      <a:ext cx="5400040" cy="2425700"/>
+                    </a:xfrm>
+                    <a:prstGeom prst="rect">
+                      <a:avLst/>
+                    </a:prstGeom>
+                  </pic:spPr>
+                </pic:pic>
+              </a:graphicData>
+            </a:graphic>
+          </wp:inline>
+        </w:drawing>
+      </w:r>
+    </w:p>
+    <w:p>
+      <w:pPr>
+        <w:pStyle w:val="Prrafodelista"/>
+        <w:rPr>
+          <w:lang w:val="es-MX"/>
+        </w:rPr>
+      </w:pPr>
+      <w:r>
+        <w:rPr>
+          <w:lang w:val="es-MX"/>
+        </w:rPr>
+        <w:drawing>
+          <wp:inline distT="0" distB="0" distL="0" distR="0" wp14:anchorId="38967BFF" wp14:editId="2CB0E78E">
+            <wp:extent cx="5400040" cy="2355850"/>
+            <wp:effectExtent l="0" t="0" r="0" b="6350"/>
+            <wp:docPr id="53" name="Imagen 53"/>
+            <wp:cNvGraphicFramePr>
+              <a:graphicFrameLocks xmlns:a="http://schemas.openxmlformats.org/drawingml/2006/main" noChangeAspect="1"/>
+            </wp:cNvGraphicFramePr>
+            <a:graphic xmlns:a="http://schemas.openxmlformats.org/drawingml/2006/main">
+              <a:graphicData uri="http://schemas.openxmlformats.org/drawingml/2006/picture">
+                <pic:pic xmlns:pic="http://schemas.openxmlformats.org/drawingml/2006/picture">
+                  <pic:nvPicPr>
+                    <pic:cNvPr id="1" name=""/>
+                    <pic:cNvPicPr/>
+                  </pic:nvPicPr>
+                  <pic:blipFill>
+                    <a:blip r:embed="rId46"/>
+                    <a:stretch>
+                      <a:fillRect/>
+                    </a:stretch>
+                  </pic:blipFill>
+                  <pic:spPr>
+                    <a:xfrm>
+                      <a:off x="0" y="0"/>
+                      <a:ext cx="5400040" cy="2355850"/>
+                    </a:xfrm>
+                    <a:prstGeom prst="rect">
+                      <a:avLst/>
+                    </a:prstGeom>
+                  </pic:spPr>
+                </pic:pic>
+              </a:graphicData>
+            </a:graphic>
+          </wp:inline>
+        </w:drawing>
       </w:r>
     </w:p>
     <w:sectPr>

</xml_diff>